<commit_message>
Tactac: acta con fecha 4-may-2026 y sede Cuautitlán (cláusula 179-3 LGSM); plazos vencidos → plan de regularización espontánea CFF 73
- Sede fuera del domicilio social validada vía art. 179 párr. 3 LGSM (unanimidad + medios electrónicos + domicilio en acta); riesgo residual documentado
- BC venció 19-may-2026 y aviso RFC venció 16-jun-2026: checklist reordenado a regularización inmediata (CFF 73; exposición 84-N-II cuantificada)
- Ficha 38/CFF exige acta protocolizada: autorización expresa en Resolución Quinta

Co-Authored-By: Claude Fable 5 <noreply@anthropic.com>
</commit_message>
<xml_diff>
--- a/Tactac/03-ACTA-ASAMBLEA-AUMENTO-CAPITAL-TACTAC.docx
+++ b/Tactac/03-ACTA-ASAMBLEA-AUMENTO-CAPITAL-TACTAC.docx
@@ -27,24 +27,7 @@
           <w:b w:val="0"/>
           <w:sz w:val="22"/>
         </w:rPr>
-        <w:t xml:space="preserve">En la Ciudad de México, domicilio social de “TRASLADOS Y ARRASTRES DE CARGA TERRESTRES AÉREOS Y CONSOLIDADOS”, SOCIEDAD ANÓNIMA DE CAPITAL VARIABLE (la “Sociedad”), en </w:t>
-      </w:r>
-      <w:r>
-        <w:rPr>
-          <w:rFonts w:ascii="Times New Roman" w:hAnsi="Times New Roman"/>
-          <w:b/>
-          <w:sz w:val="22"/>
-          <w:highlight w:val="yellow"/>
-        </w:rPr>
-        <w:t>CAMPO PENDIENTE: dirección precisa dentro de la Ciudad de México</w:t>
-      </w:r>
-      <w:r>
-        <w:rPr>
-          <w:rFonts w:ascii="Times New Roman" w:hAnsi="Times New Roman"/>
-          <w:b w:val="0"/>
-          <w:sz w:val="22"/>
-        </w:rPr>
-        <w:t xml:space="preserve">, siendo las </w:t>
+        <w:t xml:space="preserve">En el inmueble ubicado en Carretera México-Querétaro, kilómetro 30, interior JB601, colonia Cumbre Norte, Cuautitlán Izcalli, código postal 54769, Estado de México, siendo las </w:t>
       </w:r>
       <w:r>
         <w:rPr>
@@ -68,9 +51,8 @@
           <w:rFonts w:ascii="Times New Roman" w:hAnsi="Times New Roman"/>
           <w:b/>
           <w:sz w:val="22"/>
-          <w:highlight w:val="yellow"/>
         </w:rPr>
-        <w:t>CAMPO PENDIENTE: fecha, en letra</w:t>
+        <w:t>cuatro de mayo de dos mil veintiséis</w:t>
       </w:r>
       <w:r>
         <w:rPr>
@@ -110,7 +92,21 @@
           <w:b w:val="0"/>
           <w:sz w:val="22"/>
         </w:rPr>
-        <w:t>, únicos accionistas de la Sociedad, titulares en conjunto de la totalidad de las acciones representativas del capital social, con el propósito de celebrar una asamblea general ordinaria de accionistas.</w:t>
+        <w:t>, únicos accionistas de “TRASLADOS Y ARRASTRES DE CARGA TERRESTRES AÉREOS Y CONSOLIDADOS”, SOCIEDAD ANÓNIMA DE CAPITAL VARIABLE (la “Sociedad”), titulares en conjunto de la totalidad de las acciones representativas del capital social, con el propósito de celebrar una asamblea general ordinaria de accionistas.</w:t>
+      </w:r>
+    </w:p>
+    <w:p>
+      <w:pPr>
+        <w:spacing w:after="160"/>
+        <w:jc w:val="both"/>
+      </w:pPr>
+      <w:r>
+        <w:rPr>
+          <w:rFonts w:ascii="Times New Roman" w:hAnsi="Times New Roman"/>
+          <w:b w:val="0"/>
+          <w:sz w:val="22"/>
+        </w:rPr>
+        <w:t>Como cuestión previa, los accionistas, que representan la totalidad de las acciones en que se divide el capital social, aprobaron por unanimidad y de manera expresa la celebración de la presente asamblea fuera del domicilio social, precisamente en el inmueble señalado en el párrafo anterior, y dejaron constancia de que existió la posibilidad de utilizar medios electrónicos, ópticos o de cualquier otra tecnología para su celebración, todo ello con fundamento en el artículo 179, párrafo tercero, de la Ley General de Sociedades Mercantiles, quedando señalado en la presente acta, para los efectos de dicho precepto, el domicilio en el cual se llevó a cabo.</w:t>
       </w:r>
     </w:p>
     <w:p>
@@ -1187,7 +1183,7 @@
           <w:b w:val="0"/>
           <w:sz w:val="22"/>
         </w:rPr>
-        <w:t>, para que, conjunta o separadamente, ejecuten y formalicen las resoluciones adoptadas; realicen o instruyan los asientos en los libros corporativos y la emisión de los certificados y títulos; presenten ante el Servicio de Administración Tributaria el aviso de actualización de socios o accionistas previsto en el artículo 27, apartado B, fracción VI, del Código Fiscal de la Federación y en las disposiciones administrativas vigentes; actualicen el expediente de beneficiario controlador de la Sociedad conforme a los artículos 32-B Ter, 32-B Quáter y 32-B Quinquies del propio Código; y, en general, realicen cuantos actos resulten necesarios o convenientes para la plena eficacia de lo aquí resuelto, en el entendido de que el presente aumento, por corresponder a la parte variable del capital social, no requiere protocolización ante fedatario público ni inscripción en el Registro Público de Comercio, conforme a los artículos 213 y 219 de la Ley General de Sociedades Mercantiles.</w:t>
+        <w:t>, para que, conjunta o separadamente, ejecuten y formalicen las resoluciones adoptadas; realicen o instruyan los asientos en los libros corporativos y la emisión de los certificados y títulos; presenten ante el Servicio de Administración Tributaria el aviso de actualización de socios o accionistas previsto en el artículo 27, apartado B, fracción VI, del Código Fiscal de la Federación y en las disposiciones administrativas vigentes; actualicen el expediente de beneficiario controlador de la Sociedad conforme a los artículos 32-B Ter, 32-B Quáter y 32-B Quinquies del propio Código; y, en general, realicen cuantos actos resulten necesarios o convenientes para la plena eficacia de lo aquí resuelto. Lo anterior, en el entendido de que el presente aumento, por corresponder a la parte variable del capital social, no requiere para su validez protocolización ante fedatario público ni inscripción en el Registro Público de Comercio, conforme a los artículos 213 y 219 de la Ley General de Sociedades Mercantiles; sin perjuicio de lo cual se autoriza a los delegados especiales para comparecer, conjunta o separadamente, ante el fedatario público de su elección a protocolizar total o parcialmente la presente acta cuando ello resulte necesario o conveniente para la realización de trámites administrativos, incluido el aviso de actualización de socios o accionistas ante el Servicio de Administración Tributaria.</w:t>
       </w:r>
     </w:p>
     <w:p>
@@ -1373,24 +1369,7 @@
           <w:b w:val="0"/>
           <w:sz w:val="22"/>
         </w:rPr>
-        <w:t xml:space="preserve">Asamblea general ordinaria de accionistas de “Traslados y Arrastres de Carga Terrestres Aéreos y Consolidados”, S.A. de C.V., celebrada el </w:t>
-      </w:r>
-      <w:r>
-        <w:rPr>
-          <w:rFonts w:ascii="Times New Roman" w:hAnsi="Times New Roman"/>
-          <w:b/>
-          <w:sz w:val="22"/>
-          <w:highlight w:val="yellow"/>
-        </w:rPr>
-        <w:t>CAMPO PENDIENTE: fecha</w:t>
-      </w:r>
-      <w:r>
-        <w:rPr>
-          <w:rFonts w:ascii="Times New Roman" w:hAnsi="Times New Roman"/>
-          <w:b w:val="0"/>
-          <w:sz w:val="22"/>
-        </w:rPr>
-        <w:t>.</w:t>
+        <w:t>Asamblea general ordinaria de accionistas de “Traslados y Arrastres de Carga Terrestres Aéreos y Consolidados”, S.A. de C.V., celebrada el 4 de mayo de 2026.</w:t>
       </w:r>
     </w:p>
     <w:tbl>

</xml_diff>